<commit_message>
feat(diagram): barycenter layered layout with link aggregation and reference-style labels
</commit_message>
<xml_diff>
--- a/backend/assets/beechgrove-logical.docx
+++ b/backend/assets/beechgrove-logical.docx
@@ -6,7 +6,7 @@
       <w:r>
         <w:drawing>
           <wp:inline xmlns:a="http://schemas.openxmlformats.org/drawingml/2006/main" xmlns:pic="http://schemas.openxmlformats.org/drawingml/2006/picture">
-            <wp:extent cx="14239239" cy="32589284"/>
+            <wp:extent cx="16550640" cy="28416902"/>
             <wp:docPr id="1" name="Picture 1"/>
             <wp:cNvGraphicFramePr>
               <a:graphicFrameLocks noChangeAspect="1"/>
@@ -27,7 +27,7 @@
                   <pic:spPr>
                     <a:xfrm>
                       <a:off x="0" y="0"/>
-                      <a:ext cx="14239239" cy="32589284"/>
+                      <a:ext cx="16550640" cy="28416902"/>
                     </a:xfrm>
                     <a:prstGeom prst="rect"/>
                   </pic:spPr>
@@ -39,7 +39,7 @@
       </w:r>
     </w:p>
     <w:sectPr>
-      <w:pgSz w:w="23000" w:h="31680"/>
+      <w:pgSz w:w="26640" w:h="31680"/>
       <w:pgMar w:top="288" w:right="288" w:bottom="288" w:left="288" w:header="720" w:footer="720" w:gutter="0"/>
       <w:cols w:space="720"/>
       <w:docGrid w:linePitch="360"/>

</xml_diff>

<commit_message>
feat(diagram): subnet zone boxes and multi-page splitting for large sites
</commit_message>
<xml_diff>
--- a/backend/assets/beechgrove-logical.docx
+++ b/backend/assets/beechgrove-logical.docx
@@ -6,7 +6,7 @@
       <w:r>
         <w:drawing>
           <wp:inline xmlns:a="http://schemas.openxmlformats.org/drawingml/2006/main" xmlns:pic="http://schemas.openxmlformats.org/drawingml/2006/picture">
-            <wp:extent cx="16550640" cy="28416902"/>
+            <wp:extent cx="9692640" cy="10092862"/>
             <wp:docPr id="1" name="Picture 1"/>
             <wp:cNvGraphicFramePr>
               <a:graphicFrameLocks noChangeAspect="1"/>
@@ -27,7 +27,48 @@
                   <pic:spPr>
                     <a:xfrm>
                       <a:off x="0" y="0"/>
-                      <a:ext cx="16550640" cy="28416902"/>
+                      <a:ext cx="9692640" cy="10092862"/>
+                    </a:xfrm>
+                    <a:prstGeom prst="rect"/>
+                  </pic:spPr>
+                </pic:pic>
+              </a:graphicData>
+            </a:graphic>
+          </wp:inline>
+        </w:drawing>
+      </w:r>
+    </w:p>
+    <w:p>
+      <w:r>
+        <w:br w:type="page"/>
+      </w:r>
+    </w:p>
+    <w:p>
+      <w:r>
+        <w:drawing>
+          <wp:inline xmlns:a="http://schemas.openxmlformats.org/drawingml/2006/main" xmlns:pic="http://schemas.openxmlformats.org/drawingml/2006/picture">
+            <wp:extent cx="9692640" cy="10092862"/>
+            <wp:docPr id="2" name="Picture 2"/>
+            <wp:cNvGraphicFramePr>
+              <a:graphicFrameLocks noChangeAspect="1"/>
+            </wp:cNvGraphicFramePr>
+            <a:graphic>
+              <a:graphicData uri="http://schemas.openxmlformats.org/drawingml/2006/picture">
+                <pic:pic>
+                  <pic:nvPicPr>
+                    <pic:cNvPr id="0" name="image.png"/>
+                    <pic:cNvPicPr/>
+                  </pic:nvPicPr>
+                  <pic:blipFill>
+                    <a:blip r:embed="rId10"/>
+                    <a:stretch>
+                      <a:fillRect/>
+                    </a:stretch>
+                  </pic:blipFill>
+                  <pic:spPr>
+                    <a:xfrm>
+                      <a:off x="0" y="0"/>
+                      <a:ext cx="9692640" cy="10092862"/>
                     </a:xfrm>
                     <a:prstGeom prst="rect"/>
                   </pic:spPr>
@@ -39,7 +80,7 @@
       </w:r>
     </w:p>
     <w:sectPr>
-      <w:pgSz w:w="26640" w:h="31680"/>
+      <w:pgSz w:w="15840" w:h="12240" w:orient="landscape"/>
       <w:pgMar w:top="288" w:right="288" w:bottom="288" w:left="288" w:header="720" w:footer="720" w:gutter="0"/>
       <w:cols w:space="720"/>
       <w:docGrid w:linePitch="360"/>

</xml_diff>

<commit_message>
feat(diagram): selectable layout topologies (tree/star/ring/bus) with frontend selector
</commit_message>
<xml_diff>
--- a/backend/assets/beechgrove-logical.docx
+++ b/backend/assets/beechgrove-logical.docx
@@ -6,7 +6,7 @@
       <w:r>
         <w:drawing>
           <wp:inline xmlns:a="http://schemas.openxmlformats.org/drawingml/2006/main" xmlns:pic="http://schemas.openxmlformats.org/drawingml/2006/picture">
-            <wp:extent cx="9692640" cy="10092862"/>
+            <wp:extent cx="9692640" cy="9168547"/>
             <wp:docPr id="1" name="Picture 1"/>
             <wp:cNvGraphicFramePr>
               <a:graphicFrameLocks noChangeAspect="1"/>
@@ -27,7 +27,7 @@
                   <pic:spPr>
                     <a:xfrm>
                       <a:off x="0" y="0"/>
-                      <a:ext cx="9692640" cy="10092862"/>
+                      <a:ext cx="9692640" cy="9168547"/>
                     </a:xfrm>
                     <a:prstGeom prst="rect"/>
                   </pic:spPr>
@@ -47,7 +47,7 @@
       <w:r>
         <w:drawing>
           <wp:inline xmlns:a="http://schemas.openxmlformats.org/drawingml/2006/main" xmlns:pic="http://schemas.openxmlformats.org/drawingml/2006/picture">
-            <wp:extent cx="9692640" cy="10092862"/>
+            <wp:extent cx="9692640" cy="9168547"/>
             <wp:docPr id="2" name="Picture 2"/>
             <wp:cNvGraphicFramePr>
               <a:graphicFrameLocks noChangeAspect="1"/>
@@ -68,7 +68,7 @@
                   <pic:spPr>
                     <a:xfrm>
                       <a:off x="0" y="0"/>
-                      <a:ext cx="9692640" cy="10092862"/>
+                      <a:ext cx="9692640" cy="9168547"/>
                     </a:xfrm>
                     <a:prstGeom prst="rect"/>
                   </pic:spPr>

</xml_diff>

<commit_message>
fix(diagram): single title block across multi-page, labels above icons to avoid cable overlap
</commit_message>
<xml_diff>
--- a/backend/assets/beechgrove-logical.docx
+++ b/backend/assets/beechgrove-logical.docx
@@ -6,7 +6,7 @@
       <w:r>
         <w:drawing>
           <wp:inline xmlns:a="http://schemas.openxmlformats.org/drawingml/2006/main" xmlns:pic="http://schemas.openxmlformats.org/drawingml/2006/picture">
-            <wp:extent cx="9692640" cy="9168547"/>
+            <wp:extent cx="9692640" cy="8366993"/>
             <wp:docPr id="1" name="Picture 1"/>
             <wp:cNvGraphicFramePr>
               <a:graphicFrameLocks noChangeAspect="1"/>
@@ -27,7 +27,7 @@
                   <pic:spPr>
                     <a:xfrm>
                       <a:off x="0" y="0"/>
-                      <a:ext cx="9692640" cy="9168547"/>
+                      <a:ext cx="9692640" cy="8366993"/>
                     </a:xfrm>
                     <a:prstGeom prst="rect"/>
                   </pic:spPr>

</xml_diff>

<commit_message>
feat(diagram): top-down tiered layout for large sites with APs on a separate page
</commit_message>
<xml_diff>
--- a/backend/assets/beechgrove-logical.docx
+++ b/backend/assets/beechgrove-logical.docx
@@ -47,7 +47,7 @@
       <w:r>
         <w:drawing>
           <wp:inline xmlns:a="http://schemas.openxmlformats.org/drawingml/2006/main" xmlns:pic="http://schemas.openxmlformats.org/drawingml/2006/picture">
-            <wp:extent cx="9692640" cy="9168547"/>
+            <wp:extent cx="9692640" cy="8366993"/>
             <wp:docPr id="2" name="Picture 2"/>
             <wp:cNvGraphicFramePr>
               <a:graphicFrameLocks noChangeAspect="1"/>
@@ -68,7 +68,48 @@
                   <pic:spPr>
                     <a:xfrm>
                       <a:off x="0" y="0"/>
-                      <a:ext cx="9692640" cy="9168547"/>
+                      <a:ext cx="9692640" cy="8366993"/>
+                    </a:xfrm>
+                    <a:prstGeom prst="rect"/>
+                  </pic:spPr>
+                </pic:pic>
+              </a:graphicData>
+            </a:graphic>
+          </wp:inline>
+        </w:drawing>
+      </w:r>
+    </w:p>
+    <w:p>
+      <w:r>
+        <w:br w:type="page"/>
+      </w:r>
+    </w:p>
+    <w:p>
+      <w:r>
+        <w:drawing>
+          <wp:inline xmlns:a="http://schemas.openxmlformats.org/drawingml/2006/main" xmlns:pic="http://schemas.openxmlformats.org/drawingml/2006/picture">
+            <wp:extent cx="9692640" cy="5834536"/>
+            <wp:docPr id="3" name="Picture 3"/>
+            <wp:cNvGraphicFramePr>
+              <a:graphicFrameLocks noChangeAspect="1"/>
+            </wp:cNvGraphicFramePr>
+            <a:graphic>
+              <a:graphicData uri="http://schemas.openxmlformats.org/drawingml/2006/picture">
+                <pic:pic>
+                  <pic:nvPicPr>
+                    <pic:cNvPr id="0" name="image.png"/>
+                    <pic:cNvPicPr/>
+                  </pic:nvPicPr>
+                  <pic:blipFill>
+                    <a:blip r:embed="rId11"/>
+                    <a:stretch>
+                      <a:fillRect/>
+                    </a:stretch>
+                  </pic:blipFill>
+                  <pic:spPr>
+                    <a:xfrm>
+                      <a:off x="0" y="0"/>
+                      <a:ext cx="9692640" cy="5834536"/>
                     </a:xfrm>
                     <a:prstGeom prst="rect"/>
                   </pic:spPr>

</xml_diff>

<commit_message>
style(diagram): conventional boxy switch/router icons + accurate Meraki AP icons
</commit_message>
<xml_diff>
--- a/backend/assets/beechgrove-logical.docx
+++ b/backend/assets/beechgrove-logical.docx
@@ -6,7 +6,7 @@
       <w:r>
         <w:drawing>
           <wp:inline xmlns:a="http://schemas.openxmlformats.org/drawingml/2006/main" xmlns:pic="http://schemas.openxmlformats.org/drawingml/2006/picture">
-            <wp:extent cx="9692640" cy="8366993"/>
+            <wp:extent cx="9692640" cy="8699016"/>
             <wp:docPr id="1" name="Picture 1"/>
             <wp:cNvGraphicFramePr>
               <a:graphicFrameLocks noChangeAspect="1"/>
@@ -27,7 +27,7 @@
                   <pic:spPr>
                     <a:xfrm>
                       <a:off x="0" y="0"/>
-                      <a:ext cx="9692640" cy="8366993"/>
+                      <a:ext cx="9692640" cy="8699016"/>
                     </a:xfrm>
                     <a:prstGeom prst="rect"/>
                   </pic:spPr>
@@ -47,7 +47,7 @@
       <w:r>
         <w:drawing>
           <wp:inline xmlns:a="http://schemas.openxmlformats.org/drawingml/2006/main" xmlns:pic="http://schemas.openxmlformats.org/drawingml/2006/picture">
-            <wp:extent cx="9692640" cy="8366993"/>
+            <wp:extent cx="9692640" cy="8699016"/>
             <wp:docPr id="2" name="Picture 2"/>
             <wp:cNvGraphicFramePr>
               <a:graphicFrameLocks noChangeAspect="1"/>
@@ -68,7 +68,7 @@
                   <pic:spPr>
                     <a:xfrm>
                       <a:off x="0" y="0"/>
-                      <a:ext cx="9692640" cy="8366993"/>
+                      <a:ext cx="9692640" cy="8699016"/>
                     </a:xfrm>
                     <a:prstGeom prst="rect"/>
                   </pic:spPr>

</xml_diff>

<commit_message>
feat(diagram): side legend panel, router-first page ordering, label headroom
</commit_message>
<xml_diff>
--- a/backend/assets/beechgrove-logical.docx
+++ b/backend/assets/beechgrove-logical.docx
@@ -6,7 +6,7 @@
       <w:r>
         <w:drawing>
           <wp:inline xmlns:a="http://schemas.openxmlformats.org/drawingml/2006/main" xmlns:pic="http://schemas.openxmlformats.org/drawingml/2006/picture">
-            <wp:extent cx="9692640" cy="8699016"/>
+            <wp:extent cx="9692640" cy="7750735"/>
             <wp:docPr id="1" name="Picture 1"/>
             <wp:cNvGraphicFramePr>
               <a:graphicFrameLocks noChangeAspect="1"/>
@@ -27,7 +27,7 @@
                   <pic:spPr>
                     <a:xfrm>
                       <a:off x="0" y="0"/>
-                      <a:ext cx="9692640" cy="8699016"/>
+                      <a:ext cx="9692640" cy="7750735"/>
                     </a:xfrm>
                     <a:prstGeom prst="rect"/>
                   </pic:spPr>
@@ -47,7 +47,7 @@
       <w:r>
         <w:drawing>
           <wp:inline xmlns:a="http://schemas.openxmlformats.org/drawingml/2006/main" xmlns:pic="http://schemas.openxmlformats.org/drawingml/2006/picture">
-            <wp:extent cx="9692640" cy="8699016"/>
+            <wp:extent cx="9692640" cy="7750735"/>
             <wp:docPr id="2" name="Picture 2"/>
             <wp:cNvGraphicFramePr>
               <a:graphicFrameLocks noChangeAspect="1"/>
@@ -68,7 +68,7 @@
                   <pic:spPr>
                     <a:xfrm>
                       <a:off x="0" y="0"/>
-                      <a:ext cx="9692640" cy="8699016"/>
+                      <a:ext cx="9692640" cy="7750735"/>
                     </a:xfrm>
                     <a:prstGeom prst="rect"/>
                   </pic:spPr>

</xml_diff>

<commit_message>
style(diagram): remove side legend panel
</commit_message>
<xml_diff>
--- a/backend/assets/beechgrove-logical.docx
+++ b/backend/assets/beechgrove-logical.docx
@@ -6,7 +6,7 @@
       <w:r>
         <w:drawing>
           <wp:inline xmlns:a="http://schemas.openxmlformats.org/drawingml/2006/main" xmlns:pic="http://schemas.openxmlformats.org/drawingml/2006/picture">
-            <wp:extent cx="9692640" cy="7750735"/>
+            <wp:extent cx="9692640" cy="8827226"/>
             <wp:docPr id="1" name="Picture 1"/>
             <wp:cNvGraphicFramePr>
               <a:graphicFrameLocks noChangeAspect="1"/>
@@ -27,7 +27,7 @@
                   <pic:spPr>
                     <a:xfrm>
                       <a:off x="0" y="0"/>
-                      <a:ext cx="9692640" cy="7750735"/>
+                      <a:ext cx="9692640" cy="8827226"/>
                     </a:xfrm>
                     <a:prstGeom prst="rect"/>
                   </pic:spPr>
@@ -47,7 +47,7 @@
       <w:r>
         <w:drawing>
           <wp:inline xmlns:a="http://schemas.openxmlformats.org/drawingml/2006/main" xmlns:pic="http://schemas.openxmlformats.org/drawingml/2006/picture">
-            <wp:extent cx="9692640" cy="7750735"/>
+            <wp:extent cx="9692640" cy="8827226"/>
             <wp:docPr id="2" name="Picture 2"/>
             <wp:cNvGraphicFramePr>
               <a:graphicFrameLocks noChangeAspect="1"/>
@@ -68,7 +68,7 @@
                   <pic:spPr>
                     <a:xfrm>
                       <a:off x="0" y="0"/>
-                      <a:ext cx="9692640" cy="7750735"/>
+                      <a:ext cx="9692640" cy="8827226"/>
                     </a:xfrm>
                     <a:prstGeom prst="rect"/>
                   </pic:spPr>

</xml_diff>

<commit_message>
fix(diagram): restore icon aspect ratio + left-align port descriptions
</commit_message>
<xml_diff>
--- a/backend/assets/beechgrove-logical.docx
+++ b/backend/assets/beechgrove-logical.docx
@@ -6,7 +6,7 @@
       <w:r>
         <w:drawing>
           <wp:inline xmlns:a="http://schemas.openxmlformats.org/drawingml/2006/main" xmlns:pic="http://schemas.openxmlformats.org/drawingml/2006/picture">
-            <wp:extent cx="9692640" cy="8827226"/>
+            <wp:extent cx="9692640" cy="8490309"/>
             <wp:docPr id="1" name="Picture 1"/>
             <wp:cNvGraphicFramePr>
               <a:graphicFrameLocks noChangeAspect="1"/>
@@ -27,7 +27,7 @@
                   <pic:spPr>
                     <a:xfrm>
                       <a:off x="0" y="0"/>
-                      <a:ext cx="9692640" cy="8827226"/>
+                      <a:ext cx="9692640" cy="8490309"/>
                     </a:xfrm>
                     <a:prstGeom prst="rect"/>
                   </pic:spPr>
@@ -47,7 +47,7 @@
       <w:r>
         <w:drawing>
           <wp:inline xmlns:a="http://schemas.openxmlformats.org/drawingml/2006/main" xmlns:pic="http://schemas.openxmlformats.org/drawingml/2006/picture">
-            <wp:extent cx="9692640" cy="8827226"/>
+            <wp:extent cx="9692640" cy="8490309"/>
             <wp:docPr id="2" name="Picture 2"/>
             <wp:cNvGraphicFramePr>
               <a:graphicFrameLocks noChangeAspect="1"/>
@@ -68,7 +68,7 @@
                   <pic:spPr>
                     <a:xfrm>
                       <a:off x="0" y="0"/>
-                      <a:ext cx="9692640" cy="8827226"/>
+                      <a:ext cx="9692640" cy="8490309"/>
                     </a:xfrm>
                     <a:prstGeom prst="rect"/>
                   </pic:spPr>

</xml_diff>

<commit_message>
feat(diagram): overview + drill-down pages, link bundling, auto large-site mode
</commit_message>
<xml_diff>
--- a/backend/assets/beechgrove-logical.docx
+++ b/backend/assets/beechgrove-logical.docx
@@ -6,7 +6,7 @@
       <w:r>
         <w:drawing>
           <wp:inline xmlns:a="http://schemas.openxmlformats.org/drawingml/2006/main" xmlns:pic="http://schemas.openxmlformats.org/drawingml/2006/picture">
-            <wp:extent cx="9692640" cy="8490309"/>
+            <wp:extent cx="9692640" cy="7126510"/>
             <wp:docPr id="1" name="Picture 1"/>
             <wp:cNvGraphicFramePr>
               <a:graphicFrameLocks noChangeAspect="1"/>
@@ -27,7 +27,7 @@
                   <pic:spPr>
                     <a:xfrm>
                       <a:off x="0" y="0"/>
-                      <a:ext cx="9692640" cy="8490309"/>
+                      <a:ext cx="9692640" cy="7126510"/>
                     </a:xfrm>
                     <a:prstGeom prst="rect"/>
                   </pic:spPr>
@@ -88,7 +88,7 @@
       <w:r>
         <w:drawing>
           <wp:inline xmlns:a="http://schemas.openxmlformats.org/drawingml/2006/main" xmlns:pic="http://schemas.openxmlformats.org/drawingml/2006/picture">
-            <wp:extent cx="9692640" cy="5834536"/>
+            <wp:extent cx="9692640" cy="3958444"/>
             <wp:docPr id="3" name="Picture 3"/>
             <wp:cNvGraphicFramePr>
               <a:graphicFrameLocks noChangeAspect="1"/>
@@ -102,6 +102,170 @@
                   </pic:nvPicPr>
                   <pic:blipFill>
                     <a:blip r:embed="rId11"/>
+                    <a:stretch>
+                      <a:fillRect/>
+                    </a:stretch>
+                  </pic:blipFill>
+                  <pic:spPr>
+                    <a:xfrm>
+                      <a:off x="0" y="0"/>
+                      <a:ext cx="9692640" cy="3958444"/>
+                    </a:xfrm>
+                    <a:prstGeom prst="rect"/>
+                  </pic:spPr>
+                </pic:pic>
+              </a:graphicData>
+            </a:graphic>
+          </wp:inline>
+        </w:drawing>
+      </w:r>
+    </w:p>
+    <w:p>
+      <w:r>
+        <w:br w:type="page"/>
+      </w:r>
+    </w:p>
+    <w:p>
+      <w:r>
+        <w:drawing>
+          <wp:inline xmlns:a="http://schemas.openxmlformats.org/drawingml/2006/main" xmlns:pic="http://schemas.openxmlformats.org/drawingml/2006/picture">
+            <wp:extent cx="9692640" cy="7180982"/>
+            <wp:docPr id="4" name="Picture 4"/>
+            <wp:cNvGraphicFramePr>
+              <a:graphicFrameLocks noChangeAspect="1"/>
+            </wp:cNvGraphicFramePr>
+            <a:graphic>
+              <a:graphicData uri="http://schemas.openxmlformats.org/drawingml/2006/picture">
+                <pic:pic>
+                  <pic:nvPicPr>
+                    <pic:cNvPr id="0" name="image.png"/>
+                    <pic:cNvPicPr/>
+                  </pic:nvPicPr>
+                  <pic:blipFill>
+                    <a:blip r:embed="rId12"/>
+                    <a:stretch>
+                      <a:fillRect/>
+                    </a:stretch>
+                  </pic:blipFill>
+                  <pic:spPr>
+                    <a:xfrm>
+                      <a:off x="0" y="0"/>
+                      <a:ext cx="9692640" cy="7180982"/>
+                    </a:xfrm>
+                    <a:prstGeom prst="rect"/>
+                  </pic:spPr>
+                </pic:pic>
+              </a:graphicData>
+            </a:graphic>
+          </wp:inline>
+        </w:drawing>
+      </w:r>
+    </w:p>
+    <w:p>
+      <w:r>
+        <w:br w:type="page"/>
+      </w:r>
+    </w:p>
+    <w:p>
+      <w:r>
+        <w:drawing>
+          <wp:inline xmlns:a="http://schemas.openxmlformats.org/drawingml/2006/main" xmlns:pic="http://schemas.openxmlformats.org/drawingml/2006/picture">
+            <wp:extent cx="9692640" cy="7180982"/>
+            <wp:docPr id="5" name="Picture 5"/>
+            <wp:cNvGraphicFramePr>
+              <a:graphicFrameLocks noChangeAspect="1"/>
+            </wp:cNvGraphicFramePr>
+            <a:graphic>
+              <a:graphicData uri="http://schemas.openxmlformats.org/drawingml/2006/picture">
+                <pic:pic>
+                  <pic:nvPicPr>
+                    <pic:cNvPr id="0" name="image.png"/>
+                    <pic:cNvPicPr/>
+                  </pic:nvPicPr>
+                  <pic:blipFill>
+                    <a:blip r:embed="rId13"/>
+                    <a:stretch>
+                      <a:fillRect/>
+                    </a:stretch>
+                  </pic:blipFill>
+                  <pic:spPr>
+                    <a:xfrm>
+                      <a:off x="0" y="0"/>
+                      <a:ext cx="9692640" cy="7180982"/>
+                    </a:xfrm>
+                    <a:prstGeom prst="rect"/>
+                  </pic:spPr>
+                </pic:pic>
+              </a:graphicData>
+            </a:graphic>
+          </wp:inline>
+        </w:drawing>
+      </w:r>
+    </w:p>
+    <w:p>
+      <w:r>
+        <w:br w:type="page"/>
+      </w:r>
+    </w:p>
+    <w:p>
+      <w:r>
+        <w:drawing>
+          <wp:inline xmlns:a="http://schemas.openxmlformats.org/drawingml/2006/main" xmlns:pic="http://schemas.openxmlformats.org/drawingml/2006/picture">
+            <wp:extent cx="9692640" cy="7180982"/>
+            <wp:docPr id="6" name="Picture 6"/>
+            <wp:cNvGraphicFramePr>
+              <a:graphicFrameLocks noChangeAspect="1"/>
+            </wp:cNvGraphicFramePr>
+            <a:graphic>
+              <a:graphicData uri="http://schemas.openxmlformats.org/drawingml/2006/picture">
+                <pic:pic>
+                  <pic:nvPicPr>
+                    <pic:cNvPr id="0" name="image.png"/>
+                    <pic:cNvPicPr/>
+                  </pic:nvPicPr>
+                  <pic:blipFill>
+                    <a:blip r:embed="rId14"/>
+                    <a:stretch>
+                      <a:fillRect/>
+                    </a:stretch>
+                  </pic:blipFill>
+                  <pic:spPr>
+                    <a:xfrm>
+                      <a:off x="0" y="0"/>
+                      <a:ext cx="9692640" cy="7180982"/>
+                    </a:xfrm>
+                    <a:prstGeom prst="rect"/>
+                  </pic:spPr>
+                </pic:pic>
+              </a:graphicData>
+            </a:graphic>
+          </wp:inline>
+        </w:drawing>
+      </w:r>
+    </w:p>
+    <w:p>
+      <w:r>
+        <w:br w:type="page"/>
+      </w:r>
+    </w:p>
+    <w:p>
+      <w:r>
+        <w:drawing>
+          <wp:inline xmlns:a="http://schemas.openxmlformats.org/drawingml/2006/main" xmlns:pic="http://schemas.openxmlformats.org/drawingml/2006/picture">
+            <wp:extent cx="9692640" cy="5834536"/>
+            <wp:docPr id="7" name="Picture 7"/>
+            <wp:cNvGraphicFramePr>
+              <a:graphicFrameLocks noChangeAspect="1"/>
+            </wp:cNvGraphicFramePr>
+            <a:graphic>
+              <a:graphicData uri="http://schemas.openxmlformats.org/drawingml/2006/picture">
+                <pic:pic>
+                  <pic:nvPicPr>
+                    <pic:cNvPr id="0" name="image.png"/>
+                    <pic:cNvPicPr/>
+                  </pic:nvPicPr>
+                  <pic:blipFill>
+                    <a:blip r:embed="rId15"/>
                     <a:stretch>
                       <a:fillRect/>
                     </a:stretch>

</xml_diff>

<commit_message>
fix(diagram+topology): widen column spacing to clear port/switch labels, spread app canvas nodes
</commit_message>
<xml_diff>
--- a/backend/assets/beechgrove-logical.docx
+++ b/backend/assets/beechgrove-logical.docx
@@ -47,7 +47,7 @@
       <w:r>
         <w:drawing>
           <wp:inline xmlns:a="http://schemas.openxmlformats.org/drawingml/2006/main" xmlns:pic="http://schemas.openxmlformats.org/drawingml/2006/picture">
-            <wp:extent cx="9692640" cy="8490309"/>
+            <wp:extent cx="9692640" cy="6319491"/>
             <wp:docPr id="2" name="Picture 2"/>
             <wp:cNvGraphicFramePr>
               <a:graphicFrameLocks noChangeAspect="1"/>
@@ -68,7 +68,7 @@
                   <pic:spPr>
                     <a:xfrm>
                       <a:off x="0" y="0"/>
-                      <a:ext cx="9692640" cy="8490309"/>
+                      <a:ext cx="9692640" cy="6319491"/>
                     </a:xfrm>
                     <a:prstGeom prst="rect"/>
                   </pic:spPr>
@@ -88,7 +88,7 @@
       <w:r>
         <w:drawing>
           <wp:inline xmlns:a="http://schemas.openxmlformats.org/drawingml/2006/main" xmlns:pic="http://schemas.openxmlformats.org/drawingml/2006/picture">
-            <wp:extent cx="9692640" cy="3958444"/>
+            <wp:extent cx="9692640" cy="2946342"/>
             <wp:docPr id="3" name="Picture 3"/>
             <wp:cNvGraphicFramePr>
               <a:graphicFrameLocks noChangeAspect="1"/>
@@ -109,7 +109,7 @@
                   <pic:spPr>
                     <a:xfrm>
                       <a:off x="0" y="0"/>
-                      <a:ext cx="9692640" cy="3958444"/>
+                      <a:ext cx="9692640" cy="2946342"/>
                     </a:xfrm>
                     <a:prstGeom prst="rect"/>
                   </pic:spPr>

</xml_diff>